<commit_message>
feat: Accesibilidad, reestructuración descargas y fix documentos local
</commit_message>
<xml_diff>
--- a/backend/templates/modelo_pd_fp-.docx
+++ b/backend/templates/modelo_pd_fp-.docx
@@ -8,19 +8,30 @@
       </w:pPr>
       <w:r>
         <w:rPr>
+          <w:rFonts w:ascii="Arial" w:hAnsi="Arial"/>
           <w:b/>
+          <w:color w:val="000000"/>
           <w:sz w:val="28"/>
         </w:rPr>
         <w:t>Resumen de la Programación didáctica para el alumnado</w:t>
+        <w:br/>
       </w:r>
     </w:p>
     <w:p>
       <w:pPr>
-        <w:spacing w:after="40"/>
+        <w:spacing w:after="240"/>
         <w:jc w:val="center"/>
       </w:pPr>
       <w:r>
-        <w:t>{{ modulo }} — {{ ciclo }} — Curso {{ curso_academico }}</w:t>
+        <w:rPr>
+          <w:rFonts w:ascii="Arial" w:hAnsi="Arial"/>
+          <w:color w:val="000000"/>
+        </w:rPr>
+        <w:t>Módulo: {{ modulo }}</w:t>
+        <w:br/>
+        <w:t>Título: {{ ciclo }}</w:t>
+        <w:br/>
+        <w:t>Curso: {{ curso_academico }}</w:t>
       </w:r>
     </w:p>
     <w:p>
@@ -29,6 +40,7 @@
       </w:pPr>
       <w:r>
         <w:rPr>
+          <w:rFonts w:ascii="Arial" w:hAnsi="Arial"/>
           <w:i/>
         </w:rPr>
         <w:t>Seguro que tienes muchas preguntas, ¡genial!, en esta guía resumen se ha pretendido darles respuesta.</w:t>
@@ -69,11 +81,8 @@
       </w:r>
     </w:p>
     <w:p>
-      <w:pPr>
-        <w:pStyle w:val="ListBullet"/>
-      </w:pPr>
       <w:r>
-        <w:t>{{ ra1_texto }}</w:t>
+        <w:t>{%p for ra in list_ras %}</w:t>
       </w:r>
     </w:p>
     <w:p>
@@ -81,71 +90,12 @@
         <w:pStyle w:val="ListBullet"/>
       </w:pPr>
       <w:r>
-        <w:t>{{ ra2_texto }}</w:t>
+        <w:t>{{ ra }}</w:t>
       </w:r>
     </w:p>
     <w:p>
-      <w:pPr>
-        <w:pStyle w:val="ListBullet"/>
-      </w:pPr>
       <w:r>
-        <w:t>{{ ra3_texto }}</w:t>
-      </w:r>
-    </w:p>
-    <w:p>
-      <w:pPr>
-        <w:pStyle w:val="ListBullet"/>
-      </w:pPr>
-      <w:r>
-        <w:t>{{ ra4_texto }}</w:t>
-      </w:r>
-    </w:p>
-    <w:p>
-      <w:pPr>
-        <w:pStyle w:val="ListBullet"/>
-      </w:pPr>
-      <w:r>
-        <w:t>{{ ra5_texto }}</w:t>
-      </w:r>
-    </w:p>
-    <w:p>
-      <w:pPr>
-        <w:pStyle w:val="ListBullet"/>
-      </w:pPr>
-      <w:r>
-        <w:t>{{ ra6_texto }}</w:t>
-      </w:r>
-    </w:p>
-    <w:p>
-      <w:pPr>
-        <w:pStyle w:val="ListBullet"/>
-      </w:pPr>
-      <w:r>
-        <w:t>{{ ra7_texto }}</w:t>
-      </w:r>
-    </w:p>
-    <w:p>
-      <w:pPr>
-        <w:pStyle w:val="ListBullet"/>
-      </w:pPr>
-      <w:r>
-        <w:t>{{ ra8_texto }}</w:t>
-      </w:r>
-    </w:p>
-    <w:p>
-      <w:pPr>
-        <w:pStyle w:val="ListBullet"/>
-      </w:pPr>
-      <w:r>
-        <w:t>{{ ra9_texto }}</w:t>
-      </w:r>
-    </w:p>
-    <w:p>
-      <w:pPr>
-        <w:pStyle w:val="ListBullet"/>
-      </w:pPr>
-      <w:r>
-        <w:t>{{ ra10_texto }}</w:t>
+        <w:t>{%p endfor %}</w:t>
       </w:r>
     </w:p>
     <w:p>
@@ -157,11 +107,8 @@
       </w:r>
     </w:p>
     <w:p>
-      <w:pPr>
-        <w:pStyle w:val="ListBullet"/>
-      </w:pPr>
       <w:r>
-        <w:t>{{ ud1_texto }}</w:t>
+        <w:t>{%p for ud in list_uds %}</w:t>
       </w:r>
     </w:p>
     <w:p>
@@ -169,71 +116,12 @@
         <w:pStyle w:val="ListBullet"/>
       </w:pPr>
       <w:r>
-        <w:t>{{ ud2_texto }}</w:t>
+        <w:t>{{ ud }}</w:t>
       </w:r>
     </w:p>
     <w:p>
-      <w:pPr>
-        <w:pStyle w:val="ListBullet"/>
-      </w:pPr>
       <w:r>
-        <w:t>{{ ud3_texto }}</w:t>
-      </w:r>
-    </w:p>
-    <w:p>
-      <w:pPr>
-        <w:pStyle w:val="ListBullet"/>
-      </w:pPr>
-      <w:r>
-        <w:t>{{ ud4_texto }}</w:t>
-      </w:r>
-    </w:p>
-    <w:p>
-      <w:pPr>
-        <w:pStyle w:val="ListBullet"/>
-      </w:pPr>
-      <w:r>
-        <w:t>{{ ud5_texto }}</w:t>
-      </w:r>
-    </w:p>
-    <w:p>
-      <w:pPr>
-        <w:pStyle w:val="ListBullet"/>
-      </w:pPr>
-      <w:r>
-        <w:t>{{ ud6_texto }}</w:t>
-      </w:r>
-    </w:p>
-    <w:p>
-      <w:pPr>
-        <w:pStyle w:val="ListBullet"/>
-      </w:pPr>
-      <w:r>
-        <w:t>{{ ud7_texto }}</w:t>
-      </w:r>
-    </w:p>
-    <w:p>
-      <w:pPr>
-        <w:pStyle w:val="ListBullet"/>
-      </w:pPr>
-      <w:r>
-        <w:t>{{ ud8_texto }}</w:t>
-      </w:r>
-    </w:p>
-    <w:p>
-      <w:pPr>
-        <w:pStyle w:val="ListBullet"/>
-      </w:pPr>
-      <w:r>
-        <w:t>{{ ud9_texto }}</w:t>
-      </w:r>
-    </w:p>
-    <w:p>
-      <w:pPr>
-        <w:pStyle w:val="ListBullet"/>
-      </w:pPr>
-      <w:r>
-        <w:t>{{ ud10_texto }}</w:t>
+        <w:t>{%p endfor %}</w:t>
       </w:r>
     </w:p>
     <w:p>
@@ -247,51 +135,12 @@
     <w:p>
       <w:r>
         <w:rPr>
-          <w:b/>
+          <w:rFonts w:ascii="Arial" w:hAnsi="Arial"/>
         </w:rPr>
-        <w:t>{{ calif_bloque1_pct }} {{ calif_bloque1_titulo }}</w:t>
-        <w:br/>
-      </w:r>
-      <w:r>
-        <w:t>{{ calif_bloque1_desc }}</w:t>
+        <w:t>[[TABLA_INSTRUMENTOS]]</w:t>
       </w:r>
     </w:p>
-    <w:p>
-      <w:r>
-        <w:rPr>
-          <w:b/>
-        </w:rPr>
-        <w:t>{{ calif_bloque2_pct }} {{ calif_bloque2_titulo }}</w:t>
-        <w:br/>
-      </w:r>
-      <w:r>
-        <w:t>{{ calif_bloque2_desc }}</w:t>
-      </w:r>
-    </w:p>
-    <w:p>
-      <w:r>
-        <w:rPr>
-          <w:b/>
-        </w:rPr>
-        <w:t>{{ calif_bloque3_pct }} {{ calif_bloque3_titulo }}</w:t>
-        <w:br/>
-      </w:r>
-      <w:r>
-        <w:t>{{ calif_bloque3_desc }}</w:t>
-      </w:r>
-    </w:p>
-    <w:p>
-      <w:r>
-        <w:rPr>
-          <w:b/>
-        </w:rPr>
-        <w:t>{{ calif_bloque4_pct }} {{ calif_bloque4_titulo }}</w:t>
-        <w:br/>
-      </w:r>
-      <w:r>
-        <w:t>{{ calif_bloque4_desc }}</w:t>
-      </w:r>
-    </w:p>
+    <w:p/>
     <w:p>
       <w:pPr>
         <w:pStyle w:val="Heading1"/>
@@ -303,6 +152,7 @@
     <w:p>
       <w:r>
         <w:rPr>
+          <w:rFonts w:ascii="Arial" w:hAnsi="Arial"/>
           <w:b/>
         </w:rPr>
         <w:t>{{ texto_recordatorio }}</w:t>
@@ -313,12 +163,15 @@
         <w:spacing w:before="120"/>
       </w:pPr>
       <w:r>
+        <w:rPr>
+          <w:rFonts w:ascii="Arial" w:hAnsi="Arial"/>
+        </w:rPr>
         <w:t>{{ texto_final }}</w:t>
       </w:r>
     </w:p>
     <w:sectPr>
       <w:pgSz w:w="12240" w:h="15840"/>
-      <w:pgMar w:top="567" w:right="850" w:bottom="567" w:left="850" w:header="720" w:footer="720" w:gutter="0"/>
+      <w:pgMar w:top="1134" w:right="567" w:bottom="567" w:left="1134" w:header="720" w:footer="720" w:gutter="0"/>
       <w:cols w:space="720"/>
       <w:docGrid w:linePitch="360"/>
     </w:sectPr>
@@ -694,6 +547,7 @@
     </w:pPr>
     <w:rPr>
       <w:rFonts w:ascii="Arial" w:hAnsi="Arial"/>
+      <w:color w:val="000000"/>
       <w:sz w:val="18"/>
     </w:rPr>
   </w:style>
@@ -759,7 +613,7 @@
       <w:rFonts w:asciiTheme="majorHAnsi" w:eastAsiaTheme="majorEastAsia" w:hAnsiTheme="majorHAnsi" w:cstheme="majorBidi" w:ascii="Arial" w:hAnsi="Arial"/>
       <w:b/>
       <w:bCs/>
-      <w:color w:val="365F91" w:themeColor="accent1" w:themeShade="BF"/>
+      <w:color w:val="000000"/>
       <w:sz w:val="22"/>
       <w:szCs w:val="28"/>
     </w:rPr>
@@ -1228,6 +1082,7 @@
     </w:pPr>
     <w:rPr>
       <w:rFonts w:ascii="Arial" w:hAnsi="Arial"/>
+      <w:color w:val="000000"/>
       <w:sz w:val="18"/>
     </w:rPr>
   </w:style>

</xml_diff>

<commit_message>
PD-: fusionar Título/Curso en una línea, sangrías diferenciadas (RA 1cm, relación UD 2cm, contenidos UD 1cm) y quitar línea en blanco antes de la tabla
Título y Curso comparten párrafo en la plantilla (regenerada con
preparar_plantilla_pd_minima.py); curso_academico pasa a componerse como
"curso_ciclo nivel - curso_academico" en vez de ir entre corchetes.
La línea de relación RA↔UD se distingue del resto de ítems de lista por
su patrón "UDxx (" para llevar el doble de sangría. El párrafo del
marcador [[TABLA_INSTRUMENTOS]] se elimina del árbol tras insertar la
tabla en su lugar, en vez de dejarlo vacío delante.
</commit_message>
<xml_diff>
--- a/backend/templates/modelo_pd_fp-.docx
+++ b/backend/templates/modelo_pd_fp-.docx
@@ -29,9 +29,7 @@
         </w:rPr>
         <w:t>Módulo: {{ modulo }}</w:t>
         <w:br/>
-        <w:t>Título: {{ ciclo }}</w:t>
-        <w:br/>
-        <w:t>Curso: {{ curso_academico }}</w:t>
+        <w:t>Título: {{ ciclo }}. Curso: {{ curso_academico }}</w:t>
       </w:r>
     </w:p>
     <w:p>

</xml_diff>